<commit_message>
docs: update the spec with return deadline, second-chance reserve rule, late VNPay refund, withdrawal receipt and admin activity log
</commit_message>
<xml_diff>
--- a/docs/Đặc-tả-ứng-dụng-mua-bán-đấu-giá-sách-cũ.docx
+++ b/docs/Đặc-tả-ứng-dụng-mua-bán-đấu-giá-sách-cũ.docx
@@ -1355,6 +1355,24 @@
       </w:r>
       <w:r>
         <w:t xml:space="preserve"> (sai tình trạng, thiếu trang, sai ấn bản); không nhận trả vì "đổi ý". Người mua gửi lý do + ảnh; shop đồng ý hoặc từ chối; từ chối thì Admin phân xử.</w:t>
+      </w:r>
+    </w:p>
+    <w:p>
+      <w:pPr>
+        <w:pStyle w:val="ListParagraph"/>
+      </w:pPr>
+      <w:r>
+        <w:rPr/>
+        <w:t xml:space="preserve">Shop (hoặc kho với đơn đấu giá) phải trả lời yêu cầu trả hàng trong 2 ngày (Admin cấu hình được: order.return_response_days). Quá hạn không trả lời → yêu cầu tự chuyển sang Admin phân xử như khi shop từ chối; tiền vẫn do sàn giữ.</w:t>
+      </w:r>
+    </w:p>
+    <w:p>
+      <w:pPr>
+        <w:pStyle w:val="ListParagraph"/>
+      </w:pPr>
+      <w:r>
+        <w:rPr/>
+        <w:t xml:space="preserve">Người mua bấm "Đã nhận hàng" khi đang yêu cầu trả hàng được coi là rút yêu cầu: yêu cầu đóng lại, đơn hoàn tất.</w:t>
       </w:r>
     </w:p>
     <w:p>
@@ -3213,6 +3231,15 @@
     <w:p>
       <w:pPr>
         <w:pStyle w:val="ListParagraph"/>
+      </w:pPr>
+      <w:r>
+        <w:rPr/>
+        <w:t xml:space="preserve">Chỉ mời người trả giá cao thứ hai khi giá của họ ≥ giá sàn. Thấp hơn giá sàn thì không mời, lô quay lại chờ xếp phiên sau.</w:t>
+      </w:r>
+    </w:p>
+    <w:p>
+      <w:pPr>
+        <w:pStyle w:val="ListParagraph"/>
         <w:numPr>
           <w:ilvl w:val="0"/>
           <w:numId w:val="21"/>
@@ -4192,6 +4219,28 @@
     <w:p>
       <w:pPr>
         <w:pStyle w:val="ListParagraph"/>
+      </w:pPr>
+      <w:r>
+        <w:rPr>
+          <w:rStyle w:val="CodeChar"/>
+        </w:rPr>
+        <w:t xml:space="preserve">Thanh toán lại đơn đang chờ (bằng ví hoặc link VNPay mới): nếu giao dịch VNPay cũ vẫn thành công sau đó, phần tiền không còn đơn nào nhận được hoàn vào ví người mua.</w:t>
+      </w:r>
+    </w:p>
+    <w:p>
+      <w:pPr>
+        <w:pStyle w:val="ListParagraph"/>
+      </w:pPr>
+      <w:r>
+        <w:rPr>
+          <w:rStyle w:val="CodeChar"/>
+        </w:rPr>
+        <w:t xml:space="preserve">Ví của sàn (user_id rỗng) nhận phí, hoa hồng, tiền cọc bị thu; được tạo sẵn bằng migration khi khởi tạo hệ thống.</w:t>
+      </w:r>
+    </w:p>
+    <w:p>
+      <w:pPr>
+        <w:pStyle w:val="ListParagraph"/>
         <w:numPr>
           <w:ilvl w:val="0"/>
           <w:numId w:val="22"/>
@@ -4199,6 +4248,22 @@
       </w:pPr>
       <w:r>
         <w:t xml:space="preserve">Rút tiền: người bán tạo yêu cầu, Admin duyệt và đánh dấu đã chuyển (đồ án giả lập).</w:t>
+      </w:r>
+    </w:p>
+    <w:p>
+      <w:pPr>
+        <w:pStyle w:val="ListParagraph"/>
+      </w:pPr>
+      <w:r>
+        <w:t xml:space="preserve">Khi duyệt rút tiền, Admin phải nhập biên lai chuyển khoản: người chuyển, thời điểm chuyển, số tiền (phải đúng số tiền yêu cầu) và ảnh chứng từ. Biên lai lưu riêng, người bán xem được trong lịch sử rút tiền.</w:t>
+      </w:r>
+    </w:p>
+    <w:p>
+      <w:pPr>
+        <w:pStyle w:val="ListParagraph"/>
+      </w:pPr>
+      <w:r>
+        <w:t xml:space="preserve">Mọi thao tác của Admin (duyệt/từ chối tin, khóa/mở khóa tài khoản, đổi vai trò, gỡ cấm đấu giá, đánh dấu shop uy tín, duyệt rút tiền, đổi cấu hình) được ghi vào nhật ký hoạt động để tra cứu.</w:t>
       </w:r>
     </w:p>
     <w:p>

</xml_diff>